<commit_message>
added a new project to portfolio - AD
</commit_message>
<xml_diff>
--- a/portfolio-nextjs/public/assets/randstand/customer service/Nethmi_Malsha_CV.docx
+++ b/portfolio-nextjs/public/assets/randstand/customer service/Nethmi_Malsha_CV.docx
@@ -181,25 +181,15 @@
           <w:sz w:val="21"/>
           <w:szCs w:val="21"/>
         </w:rPr>
-        <w:t xml:space="preserve">Experienced administrator bringing over 2 years of financial administration, customer coordination, and records management skills from banking, retail, and office environments to support the City of Norwood </w:t>
-      </w:r>
-      <w:proofErr w:type="spellStart"/>
-      <w:r>
-        <w:rPr>
-          <w:rFonts w:ascii="Garamond" w:eastAsia="Garamond" w:hAnsi="Garamond" w:cs="Garamond"/>
-          <w:sz w:val="21"/>
-          <w:szCs w:val="21"/>
-        </w:rPr>
-        <w:t>Payneham</w:t>
-      </w:r>
-      <w:proofErr w:type="spellEnd"/>
-      <w:r>
-        <w:rPr>
-          <w:rFonts w:ascii="Garamond" w:eastAsia="Garamond" w:hAnsi="Garamond" w:cs="Garamond"/>
-          <w:sz w:val="21"/>
-          <w:szCs w:val="21"/>
-        </w:rPr>
-        <w:t xml:space="preserve"> &amp; St Peters' day-to-day office and administrative operations.</w:t>
+        <w:t>Experienced administrator bringing over 2 years of financial administration, contract and payment coordination, and records management skills from banking, retail, and office environments to support a Planning and Asset Management directorate's project, contract, and reporting operations</w:t>
+      </w:r>
+      <w:r>
+        <w:rPr>
+          <w:rFonts w:ascii="Garamond" w:eastAsia="Garamond" w:hAnsi="Garamond" w:cs="Garamond"/>
+          <w:sz w:val="21"/>
+          <w:szCs w:val="21"/>
+        </w:rPr>
+        <w:t>.</w:t>
       </w:r>
     </w:p>
     <w:p>
@@ -248,7 +238,23 @@
           <w:sz w:val="21"/>
           <w:szCs w:val="21"/>
         </w:rPr>
-        <w:t xml:space="preserve"> within a strictly regulated, compliance-driven environment.</w:t>
+        <w:t xml:space="preserve"> within a strictly regulated</w:t>
+      </w:r>
+      <w:r>
+        <w:rPr>
+          <w:rFonts w:ascii="Garamond" w:eastAsia="Garamond" w:hAnsi="Garamond" w:cs="Garamond"/>
+          <w:sz w:val="21"/>
+          <w:szCs w:val="21"/>
+        </w:rPr>
+        <w:t xml:space="preserve"> </w:t>
+      </w:r>
+      <w:r>
+        <w:rPr>
+          <w:rFonts w:ascii="Garamond" w:eastAsia="Garamond" w:hAnsi="Garamond" w:cs="Garamond"/>
+          <w:sz w:val="21"/>
+          <w:szCs w:val="21"/>
+        </w:rPr>
+        <w:t>environment.</w:t>
       </w:r>
     </w:p>
     <w:p>
@@ -271,7 +277,23 @@
           <w:sz w:val="21"/>
           <w:szCs w:val="21"/>
         </w:rPr>
-        <w:t>Provided full office administration and business support for an import/distribution company supplying electrical and lighting products across Sri Lanka, processing invoices and bank cheque payments for around 20 customers daily, verifying office invoices, and maintaining purchasing and records administration to support a multi-branch supply operation.</w:t>
+        <w:t>Provided full office administration and business support for an import/distribution company supplying electrical and lighting products across Sri Lanka, processing invoices and bank cheque payments for around 20 customers daily, verifying office invoices, and maintaining purchasing and records administration to support supply operation</w:t>
+      </w:r>
+      <w:r>
+        <w:rPr>
+          <w:rFonts w:ascii="Garamond" w:eastAsia="Garamond" w:hAnsi="Garamond" w:cs="Garamond"/>
+          <w:sz w:val="21"/>
+          <w:szCs w:val="21"/>
+        </w:rPr>
+        <w:t>s</w:t>
+      </w:r>
+      <w:r>
+        <w:rPr>
+          <w:rFonts w:ascii="Garamond" w:eastAsia="Garamond" w:hAnsi="Garamond" w:cs="Garamond"/>
+          <w:sz w:val="21"/>
+          <w:szCs w:val="21"/>
+        </w:rPr>
+        <w:t>.</w:t>
       </w:r>
     </w:p>
     <w:p>
@@ -294,7 +316,39 @@
           <w:sz w:val="21"/>
           <w:szCs w:val="21"/>
         </w:rPr>
-        <w:t>Coordinated 20–30 customer enquiries per shift in a fast-paced retail environment, liaising across departments to resolve pricing, promotional, and product issues efficiently while maintaining accurate records.</w:t>
+        <w:t>Coordinated 20–30 customer enquiries</w:t>
+      </w:r>
+      <w:r>
+        <w:rPr>
+          <w:rFonts w:ascii="Garamond" w:eastAsia="Garamond" w:hAnsi="Garamond" w:cs="Garamond"/>
+          <w:sz w:val="21"/>
+          <w:szCs w:val="21"/>
+        </w:rPr>
+        <w:t xml:space="preserve"> at Woolworths</w:t>
+      </w:r>
+      <w:r>
+        <w:rPr>
+          <w:rFonts w:ascii="Garamond" w:eastAsia="Garamond" w:hAnsi="Garamond" w:cs="Garamond"/>
+          <w:sz w:val="21"/>
+          <w:szCs w:val="21"/>
+        </w:rPr>
+        <w:t xml:space="preserve"> per shift in a fast-paced</w:t>
+      </w:r>
+      <w:r>
+        <w:rPr>
+          <w:rFonts w:ascii="Garamond" w:eastAsia="Garamond" w:hAnsi="Garamond" w:cs="Garamond"/>
+          <w:sz w:val="21"/>
+          <w:szCs w:val="21"/>
+        </w:rPr>
+        <w:t xml:space="preserve"> </w:t>
+      </w:r>
+      <w:r>
+        <w:rPr>
+          <w:rFonts w:ascii="Garamond" w:eastAsia="Garamond" w:hAnsi="Garamond" w:cs="Garamond"/>
+          <w:sz w:val="21"/>
+          <w:szCs w:val="21"/>
+        </w:rPr>
+        <w:t>environment, liaising across departments to resolve pricing, promotional, and product issues efficiently while maintaining accurate records.</w:t>
       </w:r>
     </w:p>
     <w:p>
@@ -865,12 +919,32 @@
       <w:r>
         <w:rPr>
           <w:rFonts w:ascii="Garamond" w:eastAsia="Garamond" w:hAnsi="Garamond" w:cs="Garamond"/>
+          <w:b/>
+          <w:bCs/>
+          <w:sz w:val="21"/>
+          <w:szCs w:val="21"/>
+        </w:rPr>
+        <w:t xml:space="preserve">  </w:t>
+      </w:r>
+      <w:r>
+        <w:rPr>
+          <w:rFonts w:ascii="Garamond" w:eastAsia="Garamond" w:hAnsi="Garamond" w:cs="Garamond"/>
           <w:i/>
           <w:iCs/>
           <w:sz w:val="21"/>
           <w:szCs w:val="21"/>
         </w:rPr>
-        <w:t>November 2020 – September 2021</w:t>
+        <w:t xml:space="preserve">December 2020 </w:t>
+      </w:r>
+      <w:r>
+        <w:rPr>
+          <w:rFonts w:ascii="Garamond" w:eastAsia="Garamond" w:hAnsi="Garamond" w:cs="Garamond"/>
+          <w:i/>
+          <w:iCs/>
+          <w:sz w:val="21"/>
+          <w:szCs w:val="21"/>
+        </w:rPr>
+        <w:t>– September 2021</w:t>
       </w:r>
     </w:p>
     <w:p>
@@ -1652,25 +1726,7 @@
           <w:sz w:val="21"/>
           <w:szCs w:val="21"/>
         </w:rPr>
-        <w:t xml:space="preserve">Trained new team members </w:t>
-      </w:r>
-      <w:proofErr w:type="gramStart"/>
-      <w:r>
-        <w:rPr>
-          <w:rFonts w:ascii="Garamond" w:eastAsia="Garamond" w:hAnsi="Garamond" w:cs="Garamond"/>
-          <w:sz w:val="21"/>
-          <w:szCs w:val="21"/>
-        </w:rPr>
-        <w:t>on</w:t>
-      </w:r>
-      <w:proofErr w:type="gramEnd"/>
-      <w:r>
-        <w:rPr>
-          <w:rFonts w:ascii="Garamond" w:eastAsia="Garamond" w:hAnsi="Garamond" w:cs="Garamond"/>
-          <w:sz w:val="21"/>
-          <w:szCs w:val="21"/>
-        </w:rPr>
-        <w:t xml:space="preserve"> multi-department operations and customer service standards, managed stock replenishment and processed returns in line with company policy</w:t>
+        <w:t>Trained new team members on multi-department operations and customer service standards, managed stock replenishment and processed returns in line with company policy</w:t>
       </w:r>
     </w:p>
     <w:p>
@@ -5854,6 +5910,7 @@
   <w:style w:type="character" w:default="1" w:styleId="DefaultParagraphFont">
     <w:name w:val="Default Paragraph Font"/>
     <w:uiPriority w:val="1"/>
+    <w:semiHidden/>
     <w:unhideWhenUsed/>
   </w:style>
   <w:style w:type="table" w:default="1" w:styleId="TableNormal">
@@ -6427,6 +6484,26 @@
 </file>
 
 <file path=customXml/item1.xml><?xml version="1.0" encoding="utf-8"?>
+<p:properties xmlns:p="http://schemas.microsoft.com/office/2006/metadata/properties" xmlns:xsi="http://www.w3.org/2001/XMLSchema-instance" xmlns:pc="http://schemas.microsoft.com/office/infopath/2007/PartnerControls">
+  <documentManagement>
+    <lcf76f155ced4ddcb4097134ff3c332f xmlns="d1c7576f-0a17-4153-96c3-e6b3b35b3899">
+      <Terms xmlns="http://schemas.microsoft.com/office/infopath/2007/PartnerControls"/>
+    </lcf76f155ced4ddcb4097134ff3c332f>
+    <TaxCatchAll xmlns="2a996e9b-acda-4a2a-ae73-4af3523026d5" xsi:nil="true"/>
+  </documentManagement>
+</p:properties>
+</file>
+
+<file path=customXml/item2.xml><?xml version="1.0" encoding="utf-8"?>
+<?mso-contentType ?>
+<FormTemplates xmlns="http://schemas.microsoft.com/sharepoint/v3/contenttype/forms">
+  <Display>DocumentLibraryForm</Display>
+  <Edit>DocumentLibraryForm</Edit>
+  <New>DocumentLibraryForm</New>
+</FormTemplates>
+</file>
+
+<file path=customXml/item3.xml><?xml version="1.0" encoding="utf-8"?>
 <ct:contentTypeSchema xmlns:ct="http://schemas.microsoft.com/office/2006/metadata/contentType" xmlns:ma="http://schemas.microsoft.com/office/2006/metadata/properties/metaAttributes" ct:_="" ma:_="" ma:contentTypeName="Document" ma:contentTypeID="0x010100D37685B740EC79408259AE2BD0A2D92D" ma:contentTypeVersion="14" ma:contentTypeDescription="Create a new document." ma:contentTypeScope="" ma:versionID="d293ee6242f7f7b864a016566060e731">
   <xsd:schema xmlns:xsd="http://www.w3.org/2001/XMLSchema" xmlns:xs="http://www.w3.org/2001/XMLSchema" xmlns:p="http://schemas.microsoft.com/office/2006/metadata/properties" xmlns:ns2="2a996e9b-acda-4a2a-ae73-4af3523026d5" xmlns:ns3="d1c7576f-0a17-4153-96c3-e6b3b35b3899" targetNamespace="http://schemas.microsoft.com/office/2006/metadata/properties" ma:root="true" ma:fieldsID="442545ca9e13bd2b125149bb7aadc792" ns2:_="" ns3:_="">
     <xsd:import namespace="2a996e9b-acda-4a2a-ae73-4af3523026d5"/>
@@ -6655,27 +6732,26 @@
 </ct:contentTypeSchema>
 </file>
 
-<file path=customXml/item2.xml><?xml version="1.0" encoding="utf-8"?>
-<?mso-contentType ?>
-<FormTemplates xmlns="http://schemas.microsoft.com/sharepoint/v3/contenttype/forms">
-  <Display>DocumentLibraryForm</Display>
-  <Edit>DocumentLibraryForm</Edit>
-  <New>DocumentLibraryForm</New>
-</FormTemplates>
+<file path=customXml/itemProps1.xml><?xml version="1.0" encoding="utf-8"?>
+<ds:datastoreItem xmlns:ds="http://schemas.openxmlformats.org/officeDocument/2006/customXml" ds:itemID="{9F4D1EA1-CF5E-4216-9C85-B7E81641A4CD}">
+  <ds:schemaRefs>
+    <ds:schemaRef ds:uri="http://schemas.microsoft.com/office/2006/metadata/properties"/>
+    <ds:schemaRef ds:uri="http://schemas.microsoft.com/office/infopath/2007/PartnerControls"/>
+    <ds:schemaRef ds:uri="d1c7576f-0a17-4153-96c3-e6b3b35b3899"/>
+    <ds:schemaRef ds:uri="2a996e9b-acda-4a2a-ae73-4af3523026d5"/>
+  </ds:schemaRefs>
+</ds:datastoreItem>
 </file>
 
-<file path=customXml/item3.xml><?xml version="1.0" encoding="utf-8"?>
-<p:properties xmlns:p="http://schemas.microsoft.com/office/2006/metadata/properties" xmlns:xsi="http://www.w3.org/2001/XMLSchema-instance" xmlns:pc="http://schemas.microsoft.com/office/infopath/2007/PartnerControls">
-  <documentManagement>
-    <lcf76f155ced4ddcb4097134ff3c332f xmlns="d1c7576f-0a17-4153-96c3-e6b3b35b3899">
-      <Terms xmlns="http://schemas.microsoft.com/office/infopath/2007/PartnerControls"/>
-    </lcf76f155ced4ddcb4097134ff3c332f>
-    <TaxCatchAll xmlns="2a996e9b-acda-4a2a-ae73-4af3523026d5" xsi:nil="true"/>
-  </documentManagement>
-</p:properties>
+<file path=customXml/itemProps2.xml><?xml version="1.0" encoding="utf-8"?>
+<ds:datastoreItem xmlns:ds="http://schemas.openxmlformats.org/officeDocument/2006/customXml" ds:itemID="{CF5FB6E7-A738-4493-826E-BD78D5FD94FC}">
+  <ds:schemaRefs>
+    <ds:schemaRef ds:uri="http://schemas.microsoft.com/sharepoint/v3/contenttype/forms"/>
+  </ds:schemaRefs>
+</ds:datastoreItem>
 </file>
 
-<file path=customXml/itemProps1.xml><?xml version="1.0" encoding="utf-8"?>
+<file path=customXml/itemProps3.xml><?xml version="1.0" encoding="utf-8"?>
 <ds:datastoreItem xmlns:ds="http://schemas.openxmlformats.org/officeDocument/2006/customXml" ds:itemID="{31345B7C-F2F2-4A33-A172-2F94FB7320A2}">
   <ds:schemaRefs>
     <ds:schemaRef ds:uri="http://schemas.microsoft.com/office/2006/metadata/contentType"/>
@@ -6692,23 +6768,4 @@
     <ds:schemaRef ds:uri="http://schemas.microsoft.com/internal/obd"/>
   </ds:schemaRefs>
 </ds:datastoreItem>
-</file>
-
-<file path=customXml/itemProps2.xml><?xml version="1.0" encoding="utf-8"?>
-<ds:datastoreItem xmlns:ds="http://schemas.openxmlformats.org/officeDocument/2006/customXml" ds:itemID="{CF5FB6E7-A738-4493-826E-BD78D5FD94FC}">
-  <ds:schemaRefs>
-    <ds:schemaRef ds:uri="http://schemas.microsoft.com/sharepoint/v3/contenttype/forms"/>
-  </ds:schemaRefs>
-</ds:datastoreItem>
-</file>
-
-<file path=customXml/itemProps3.xml><?xml version="1.0" encoding="utf-8"?>
-<ds:datastoreItem xmlns:ds="http://schemas.openxmlformats.org/officeDocument/2006/customXml" ds:itemID="{9F4D1EA1-CF5E-4216-9C85-B7E81641A4CD}">
-  <ds:schemaRefs>
-    <ds:schemaRef ds:uri="http://schemas.microsoft.com/office/2006/metadata/properties"/>
-    <ds:schemaRef ds:uri="http://schemas.microsoft.com/office/infopath/2007/PartnerControls"/>
-    <ds:schemaRef ds:uri="d1c7576f-0a17-4153-96c3-e6b3b35b3899"/>
-    <ds:schemaRef ds:uri="2a996e9b-acda-4a2a-ae73-4af3523026d5"/>
-  </ds:schemaRefs>
-</ds:datastoreItem>
 </file>
</xml_diff>